<commit_message>
adding workEquipment module and some code refactoring
</commit_message>
<xml_diff>
--- a/server/resources/tampletes/predare.docx
+++ b/server/resources/tampletes/predare.docx
@@ -648,7 +648,27 @@
                 <w:szCs w:val="22"/>
                 <w:lang w:val="ro-RO"/>
               </w:rPr>
-              <w:t>{cit}{/echipament}</w:t>
+              <w:t>{</w:t>
+            </w:r>
+            <w:proofErr w:type="spellStart"/>
+            <w:r>
+              <w:rPr>
+                <w:rFonts w:ascii="Calibri" w:hAnsi="Calibri"/>
+                <w:sz w:val="22"/>
+                <w:szCs w:val="22"/>
+                <w:lang w:val="ro-RO"/>
+              </w:rPr>
+              <w:t>id</w:t>
+            </w:r>
+            <w:proofErr w:type="spellEnd"/>
+            <w:r>
+              <w:rPr>
+                <w:rFonts w:ascii="Calibri" w:hAnsi="Calibri"/>
+                <w:sz w:val="22"/>
+                <w:szCs w:val="22"/>
+                <w:lang w:val="ro-RO"/>
+              </w:rPr>
+              <w:t>}{/echipament}</w:t>
             </w:r>
           </w:p>
         </w:tc>
@@ -673,6 +693,42 @@
         </w:tc>
       </w:tr>
     </w:tbl>
+    <w:p>
+      <w:pPr>
+        <w:pStyle w:val="BodyText"/>
+        <w:spacing w:after="0" w:line="360" w:lineRule="auto"/>
+        <w:rPr>
+          <w:rFonts w:ascii="Calibri" w:hAnsi="Calibri"/>
+          <w:sz w:val="22"/>
+          <w:szCs w:val="22"/>
+          <w:lang w:val="ro-RO"/>
+        </w:rPr>
+      </w:pPr>
+    </w:p>
+    <w:p>
+      <w:pPr>
+        <w:pStyle w:val="BodyText"/>
+        <w:spacing w:after="0" w:line="360" w:lineRule="auto"/>
+        <w:rPr>
+          <w:rFonts w:ascii="Calibri" w:hAnsi="Calibri"/>
+          <w:sz w:val="22"/>
+          <w:szCs w:val="22"/>
+          <w:lang w:val="ro-RO"/>
+        </w:rPr>
+      </w:pPr>
+    </w:p>
+    <w:p>
+      <w:pPr>
+        <w:pStyle w:val="BodyText"/>
+        <w:spacing w:after="0" w:line="360" w:lineRule="auto"/>
+        <w:rPr>
+          <w:rFonts w:ascii="Calibri" w:hAnsi="Calibri"/>
+          <w:sz w:val="22"/>
+          <w:szCs w:val="22"/>
+          <w:lang w:val="ro-RO"/>
+        </w:rPr>
+      </w:pPr>
+    </w:p>
     <w:p>
       <w:pPr>
         <w:pStyle w:val="BodyText"/>
@@ -1176,14 +1232,12 @@
     </w:tbl>
     <w:p/>
     <w:sectPr>
-      <w:headerReference w:type="even" r:id="rId7"/>
-      <w:headerReference w:type="default" r:id="rId8"/>
-      <w:footerReference w:type="even" r:id="rId9"/>
-      <w:footerReference w:type="default" r:id="rId10"/>
-      <w:headerReference w:type="first" r:id="rId11"/>
-      <w:footerReference w:type="first" r:id="rId12"/>
+      <w:headerReference w:type="default" r:id="rId7"/>
+      <w:footerReference w:type="default" r:id="rId8"/>
+      <w:headerReference w:type="first" r:id="rId9"/>
+      <w:footerReference w:type="first" r:id="rId10"/>
       <w:pgSz w:w="11907" w:h="16840" w:code="9"/>
-      <w:pgMar w:top="1247" w:right="851" w:bottom="794" w:left="1554" w:header="1319" w:footer="680" w:gutter="0"/>
+      <w:pgMar w:top="1247" w:right="851" w:bottom="794" w:left="1554" w:header="576" w:footer="0" w:gutter="0"/>
       <w:cols w:space="720"/>
       <w:titlePg/>
       <w:docGrid w:linePitch="360"/>
@@ -1218,16 +1272,6 @@
 </file>
 
 <file path=word/footer1.xml><?xml version="1.0" encoding="utf-8"?>
-<w:ftr xmlns:wpc="http://schemas.microsoft.com/office/word/2010/wordprocessingCanvas" xmlns:cx="http://schemas.microsoft.com/office/drawing/2014/chartex" xmlns:cx1="http://schemas.microsoft.com/office/drawing/2015/9/8/chartex" xmlns:cx2="http://schemas.microsoft.com/office/drawing/2015/10/21/chartex" xmlns:cx3="http://schemas.microsoft.com/office/drawing/2016/5/9/chartex" xmlns:cx4="http://schemas.microsoft.com/office/drawing/2016/5/10/chartex" xmlns:cx5="http://schemas.microsoft.com/office/drawing/2016/5/11/chartex" xmlns:cx6="http://schemas.microsoft.com/office/drawing/2016/5/12/chartex" xmlns:cx7="http://schemas.microsoft.com/office/drawing/2016/5/13/chartex" xmlns:cx8="http://schemas.microsoft.com/office/drawing/2016/5/14/chartex" xmlns:mc="http://schemas.openxmlformats.org/markup-compatibility/2006" xmlns:aink="http://schemas.microsoft.com/office/drawing/2016/ink" xmlns:am3d="http://schemas.microsoft.com/office/drawing/2017/model3d" xmlns:o="urn:schemas-microsoft-com:office:office" xmlns:r="http://schemas.openxmlformats.org/officeDocument/2006/relationships" xmlns:m="http://schemas.openxmlformats.org/officeDocument/2006/math" xmlns:v="urn:schemas-microsoft-com:vml" xmlns:wp14="http://schemas.microsoft.com/office/word/2010/wordprocessingDrawing" xmlns:wp="http://schemas.openxmlformats.org/drawingml/2006/wordprocessingDrawing" xmlns:w10="urn:schemas-microsoft-com:office:word" xmlns:w="http://schemas.openxmlformats.org/wordprocessingml/2006/main" xmlns:w14="http://schemas.microsoft.com/office/word/2010/wordml" xmlns:w15="http://schemas.microsoft.com/office/word/2012/wordml" xmlns:w16cex="http://schemas.microsoft.com/office/word/2018/wordml/cex" xmlns:w16cid="http://schemas.microsoft.com/office/word/2016/wordml/cid" xmlns:w16="http://schemas.microsoft.com/office/word/2018/wordml" xmlns:w16sdtdh="http://schemas.microsoft.com/office/word/2020/wordml/sdtdatahash" xmlns:w16se="http://schemas.microsoft.com/office/word/2015/wordml/symex" xmlns:wpg="http://schemas.microsoft.com/office/word/2010/wordprocessingGroup" xmlns:wpi="http://schemas.microsoft.com/office/word/2010/wordprocessingInk" xmlns:wne="http://schemas.microsoft.com/office/word/2006/wordml" xmlns:wps="http://schemas.microsoft.com/office/word/2010/wordprocessingShape" mc:Ignorable="w14 w15 w16se w16cid w16 w16cex w16sdtdh wp14">
-  <w:p>
-    <w:pPr>
-      <w:pStyle w:val="Footer"/>
-    </w:pPr>
-  </w:p>
-</w:ftr>
-</file>
-
-<file path=word/footer2.xml><?xml version="1.0" encoding="utf-8"?>
 <w:ftr xmlns:wpc="http://schemas.microsoft.com/office/word/2010/wordprocessingCanvas" xmlns:cx="http://schemas.microsoft.com/office/drawing/2014/chartex" xmlns:cx1="http://schemas.microsoft.com/office/drawing/2015/9/8/chartex" xmlns:cx2="http://schemas.microsoft.com/office/drawing/2015/10/21/chartex" xmlns:cx3="http://schemas.microsoft.com/office/drawing/2016/5/9/chartex" xmlns:cx4="http://schemas.microsoft.com/office/drawing/2016/5/10/chartex" xmlns:cx5="http://schemas.microsoft.com/office/drawing/2016/5/11/chartex" xmlns:cx6="http://schemas.microsoft.com/office/drawing/2016/5/12/chartex" xmlns:cx7="http://schemas.microsoft.com/office/drawing/2016/5/13/chartex" xmlns:cx8="http://schemas.microsoft.com/office/drawing/2016/5/14/chartex" xmlns:mc="http://schemas.openxmlformats.org/markup-compatibility/2006" xmlns:aink="http://schemas.microsoft.com/office/drawing/2016/ink" xmlns:am3d="http://schemas.microsoft.com/office/drawing/2017/model3d" xmlns:o="urn:schemas-microsoft-com:office:office" xmlns:r="http://schemas.openxmlformats.org/officeDocument/2006/relationships" xmlns:m="http://schemas.openxmlformats.org/officeDocument/2006/math" xmlns:v="urn:schemas-microsoft-com:vml" xmlns:wp14="http://schemas.microsoft.com/office/word/2010/wordprocessingDrawing" xmlns:wp="http://schemas.openxmlformats.org/drawingml/2006/wordprocessingDrawing" xmlns:w10="urn:schemas-microsoft-com:office:word" xmlns:w="http://schemas.openxmlformats.org/wordprocessingml/2006/main" xmlns:w14="http://schemas.microsoft.com/office/word/2010/wordml" xmlns:w15="http://schemas.microsoft.com/office/word/2012/wordml" xmlns:w16cex="http://schemas.microsoft.com/office/word/2018/wordml/cex" xmlns:w16cid="http://schemas.microsoft.com/office/word/2016/wordml/cid" xmlns:w16="http://schemas.microsoft.com/office/word/2018/wordml" xmlns:w16sdtdh="http://schemas.microsoft.com/office/word/2020/wordml/sdtdatahash" xmlns:w16se="http://schemas.microsoft.com/office/word/2015/wordml/symex" xmlns:wpg="http://schemas.microsoft.com/office/word/2010/wordprocessingGroup" xmlns:wpi="http://schemas.microsoft.com/office/word/2010/wordprocessingInk" xmlns:wne="http://schemas.microsoft.com/office/word/2006/wordml" xmlns:wps="http://schemas.microsoft.com/office/word/2010/wordprocessingShape" mc:Ignorable="w14 w15 w16se w16cid w16 w16cex w16sdtdh wp14">
   <w:p>
     <w:pPr>
@@ -1461,7 +1505,7 @@
 </w:ftr>
 </file>
 
-<file path=word/footer3.xml><?xml version="1.0" encoding="utf-8"?>
+<file path=word/footer2.xml><?xml version="1.0" encoding="utf-8"?>
 <w:ftr xmlns:wpc="http://schemas.microsoft.com/office/word/2010/wordprocessingCanvas" xmlns:cx="http://schemas.microsoft.com/office/drawing/2014/chartex" xmlns:cx1="http://schemas.microsoft.com/office/drawing/2015/9/8/chartex" xmlns:cx2="http://schemas.microsoft.com/office/drawing/2015/10/21/chartex" xmlns:cx3="http://schemas.microsoft.com/office/drawing/2016/5/9/chartex" xmlns:cx4="http://schemas.microsoft.com/office/drawing/2016/5/10/chartex" xmlns:cx5="http://schemas.microsoft.com/office/drawing/2016/5/11/chartex" xmlns:cx6="http://schemas.microsoft.com/office/drawing/2016/5/12/chartex" xmlns:cx7="http://schemas.microsoft.com/office/drawing/2016/5/13/chartex" xmlns:cx8="http://schemas.microsoft.com/office/drawing/2016/5/14/chartex" xmlns:mc="http://schemas.openxmlformats.org/markup-compatibility/2006" xmlns:aink="http://schemas.microsoft.com/office/drawing/2016/ink" xmlns:am3d="http://schemas.microsoft.com/office/drawing/2017/model3d" xmlns:o="urn:schemas-microsoft-com:office:office" xmlns:r="http://schemas.openxmlformats.org/officeDocument/2006/relationships" xmlns:m="http://schemas.openxmlformats.org/officeDocument/2006/math" xmlns:v="urn:schemas-microsoft-com:vml" xmlns:wp14="http://schemas.microsoft.com/office/word/2010/wordprocessingDrawing" xmlns:wp="http://schemas.openxmlformats.org/drawingml/2006/wordprocessingDrawing" xmlns:w10="urn:schemas-microsoft-com:office:word" xmlns:w="http://schemas.openxmlformats.org/wordprocessingml/2006/main" xmlns:w14="http://schemas.microsoft.com/office/word/2010/wordml" xmlns:w15="http://schemas.microsoft.com/office/word/2012/wordml" xmlns:w16cex="http://schemas.microsoft.com/office/word/2018/wordml/cex" xmlns:w16cid="http://schemas.microsoft.com/office/word/2016/wordml/cid" xmlns:w16="http://schemas.microsoft.com/office/word/2018/wordml" xmlns:w16sdtdh="http://schemas.microsoft.com/office/word/2020/wordml/sdtdatahash" xmlns:w16se="http://schemas.microsoft.com/office/word/2015/wordml/symex" xmlns:wpg="http://schemas.microsoft.com/office/word/2010/wordprocessingGroup" xmlns:wpi="http://schemas.microsoft.com/office/word/2010/wordprocessingInk" xmlns:wne="http://schemas.microsoft.com/office/word/2006/wordml" xmlns:wps="http://schemas.microsoft.com/office/word/2010/wordprocessingShape" mc:Ignorable="w14 w15 w16se w16cid w16 w16cex w16sdtdh wp14">
   <w:p>
     <w:pPr>
@@ -1889,16 +1933,6 @@
     <w:pPr>
       <w:pStyle w:val="Header"/>
     </w:pPr>
-  </w:p>
-</w:hdr>
-</file>
-
-<file path=word/header2.xml><?xml version="1.0" encoding="utf-8"?>
-<w:hdr xmlns:wpc="http://schemas.microsoft.com/office/word/2010/wordprocessingCanvas" xmlns:cx="http://schemas.microsoft.com/office/drawing/2014/chartex" xmlns:cx1="http://schemas.microsoft.com/office/drawing/2015/9/8/chartex" xmlns:cx2="http://schemas.microsoft.com/office/drawing/2015/10/21/chartex" xmlns:cx3="http://schemas.microsoft.com/office/drawing/2016/5/9/chartex" xmlns:cx4="http://schemas.microsoft.com/office/drawing/2016/5/10/chartex" xmlns:cx5="http://schemas.microsoft.com/office/drawing/2016/5/11/chartex" xmlns:cx6="http://schemas.microsoft.com/office/drawing/2016/5/12/chartex" xmlns:cx7="http://schemas.microsoft.com/office/drawing/2016/5/13/chartex" xmlns:cx8="http://schemas.microsoft.com/office/drawing/2016/5/14/chartex" xmlns:mc="http://schemas.openxmlformats.org/markup-compatibility/2006" xmlns:aink="http://schemas.microsoft.com/office/drawing/2016/ink" xmlns:am3d="http://schemas.microsoft.com/office/drawing/2017/model3d" xmlns:o="urn:schemas-microsoft-com:office:office" xmlns:r="http://schemas.openxmlformats.org/officeDocument/2006/relationships" xmlns:m="http://schemas.openxmlformats.org/officeDocument/2006/math" xmlns:v="urn:schemas-microsoft-com:vml" xmlns:wp14="http://schemas.microsoft.com/office/word/2010/wordprocessingDrawing" xmlns:wp="http://schemas.openxmlformats.org/drawingml/2006/wordprocessingDrawing" xmlns:w10="urn:schemas-microsoft-com:office:word" xmlns:w="http://schemas.openxmlformats.org/wordprocessingml/2006/main" xmlns:w14="http://schemas.microsoft.com/office/word/2010/wordml" xmlns:w15="http://schemas.microsoft.com/office/word/2012/wordml" xmlns:w16cex="http://schemas.microsoft.com/office/word/2018/wordml/cex" xmlns:w16cid="http://schemas.microsoft.com/office/word/2016/wordml/cid" xmlns:w16="http://schemas.microsoft.com/office/word/2018/wordml" xmlns:w16sdtdh="http://schemas.microsoft.com/office/word/2020/wordml/sdtdatahash" xmlns:w16se="http://schemas.microsoft.com/office/word/2015/wordml/symex" xmlns:wpg="http://schemas.microsoft.com/office/word/2010/wordprocessingGroup" xmlns:wpi="http://schemas.microsoft.com/office/word/2010/wordprocessingInk" xmlns:wne="http://schemas.microsoft.com/office/word/2006/wordml" xmlns:wps="http://schemas.microsoft.com/office/word/2010/wordprocessingShape" mc:Ignorable="w14 w15 w16se w16cid w16 w16cex w16sdtdh wp14">
-  <w:p>
-    <w:pPr>
-      <w:pStyle w:val="Header"/>
-    </w:pPr>
     <w:r>
       <w:pict w14:anchorId="2C0F125A">
         <v:shapetype id="_x0000_t75" coordsize="21600,21600" o:spt="75" o:preferrelative="t" path="m@4@5l@4@11@9@11@9@5xe" filled="f" stroked="f">
@@ -1929,7 +1963,7 @@
 </w:hdr>
 </file>
 
-<file path=word/header3.xml><?xml version="1.0" encoding="utf-8"?>
+<file path=word/header2.xml><?xml version="1.0" encoding="utf-8"?>
 <w:hdr xmlns:wpc="http://schemas.microsoft.com/office/word/2010/wordprocessingCanvas" xmlns:cx="http://schemas.microsoft.com/office/drawing/2014/chartex" xmlns:cx1="http://schemas.microsoft.com/office/drawing/2015/9/8/chartex" xmlns:cx2="http://schemas.microsoft.com/office/drawing/2015/10/21/chartex" xmlns:cx3="http://schemas.microsoft.com/office/drawing/2016/5/9/chartex" xmlns:cx4="http://schemas.microsoft.com/office/drawing/2016/5/10/chartex" xmlns:cx5="http://schemas.microsoft.com/office/drawing/2016/5/11/chartex" xmlns:cx6="http://schemas.microsoft.com/office/drawing/2016/5/12/chartex" xmlns:cx7="http://schemas.microsoft.com/office/drawing/2016/5/13/chartex" xmlns:cx8="http://schemas.microsoft.com/office/drawing/2016/5/14/chartex" xmlns:mc="http://schemas.openxmlformats.org/markup-compatibility/2006" xmlns:aink="http://schemas.microsoft.com/office/drawing/2016/ink" xmlns:am3d="http://schemas.microsoft.com/office/drawing/2017/model3d" xmlns:o="urn:schemas-microsoft-com:office:office" xmlns:r="http://schemas.openxmlformats.org/officeDocument/2006/relationships" xmlns:m="http://schemas.openxmlformats.org/officeDocument/2006/math" xmlns:v="urn:schemas-microsoft-com:vml" xmlns:wp14="http://schemas.microsoft.com/office/word/2010/wordprocessingDrawing" xmlns:wp="http://schemas.openxmlformats.org/drawingml/2006/wordprocessingDrawing" xmlns:w10="urn:schemas-microsoft-com:office:word" xmlns:w="http://schemas.openxmlformats.org/wordprocessingml/2006/main" xmlns:w14="http://schemas.microsoft.com/office/word/2010/wordml" xmlns:w15="http://schemas.microsoft.com/office/word/2012/wordml" xmlns:w16cex="http://schemas.microsoft.com/office/word/2018/wordml/cex" xmlns:w16cid="http://schemas.microsoft.com/office/word/2016/wordml/cid" xmlns:w16="http://schemas.microsoft.com/office/word/2018/wordml" xmlns:w16sdtdh="http://schemas.microsoft.com/office/word/2020/wordml/sdtdatahash" xmlns:w16se="http://schemas.microsoft.com/office/word/2015/wordml/symex" xmlns:wpg="http://schemas.microsoft.com/office/word/2010/wordprocessingGroup" xmlns:wpi="http://schemas.microsoft.com/office/word/2010/wordprocessingInk" xmlns:wne="http://schemas.microsoft.com/office/word/2006/wordml" xmlns:wps="http://schemas.microsoft.com/office/word/2010/wordprocessingShape" mc:Ignorable="w14 w15 w16se w16cid w16 w16cex w16sdtdh wp14">
   <w:p>
     <w:pPr>
@@ -1972,7 +2006,7 @@
           <v:path o:extrusionok="f" gradientshapeok="t" o:connecttype="rect"/>
           <o:lock v:ext="edit" aspectratio="t"/>
         </v:shapetype>
-        <v:shape id="Picture 1" o:spid="_x0000_s2072" type="#_x0000_t75" alt="header" style="position:absolute;left:0;text-align:left;margin-left:.3pt;margin-top:-15.65pt;width:114pt;height:114pt;z-index:1;visibility:visible;mso-wrap-style:square;mso-position-horizontal-relative:text;mso-position-vertical-relative:text;mso-width-relative:page;mso-height-relative:page">
+        <v:shape id="Picture 1" o:spid="_x0000_s2072" type="#_x0000_t75" alt="header" style="position:absolute;left:0;text-align:left;margin-left:.3pt;margin-top:8.95pt;width:114pt;height:114pt;z-index:1;visibility:visible;mso-wrap-style:square;mso-position-horizontal-relative:text;mso-position-vertical-relative:text;mso-width-relative:page;mso-height-relative:page">
           <v:imagedata r:id="rId1" o:title="header"/>
           <w10:wrap type="square"/>
         </v:shape>

</xml_diff>